<commit_message>
feat(B0063): 잡코리아 이력서 정합 — type +activity+skill / website_url
노아 결정 (2026-06-29): 자기소개서 단일 유지, 서명 X, 정합성 중요.

마이그레이션 20260629000000 (prod 적용 완료)
- student_resume_item.type enum +activity (기타활동) +skill (활용능력)
- student_profile.website_url (text, http/https only, 2048자 cap)

코드 정합
- entity 2 (resume-item / profile)
- repository (profile)
- form 2 (profile / resume-items-editor) — UI 라벨 + select 옵션 추가
- PDF template (8 → 10 섹션)
- docx 양식 sync — 학생들에게 카톡 공유 가능 (docs/share/Fan-to-Pro-이력서-양식.docx)

권한 표면 변경 0 (additive only). Sage 검토 불필요.

Co-Authored-By: Claude Opus 4.7 (1M context) <noreply@anthropic.com>
</commit_message>
<xml_diff>
--- a/docs/share/Fan-to-Pro-이력서-양식.docx
+++ b/docs/share/Fan-to-Pro-이력서-양식.docx
@@ -374,6 +374,35 @@
     </w:p>
     <w:p>
       <w:pPr>
+        <w:spacing w:after="40" w:before="100"/>
+      </w:pPr>
+      <w:r>
+        <w:rPr>
+          <w:b/>
+          <w:bCs/>
+          <w:color w:val="1A1D23"/>
+          <w:sz w:val="22"/>
+          <w:szCs w:val="22"/>
+        </w:rPr>
+        <w:t xml:space="preserve">▪ 홈페이지 / SNS / 포트폴리오 (URL)</w:t>
+      </w:r>
+    </w:p>
+    <w:p>
+      <w:pPr>
+        <w:pBdr>
+          <w:bottom w:val="single" w:color="D0D5DC" w:sz="4"/>
+        </w:pBdr>
+        <w:spacing w:after="100"/>
+      </w:pPr>
+      <w:r>
+        <w:rPr>
+          <w:color w:val="FFFFFF"/>
+        </w:rPr>
+        <w:t xml:space="preserve">                                                                                                                                </w:t>
+      </w:r>
+    </w:p>
+    <w:p>
+      <w:pPr>
         <w:pBdr>
           <w:top w:val="single" w:color="FF5B6E" w:sz="4"/>
           <w:bottom w:val="none" w:color="FFFFFF" w:sz="0"/>
@@ -1555,6 +1584,468 @@
           <w:szCs w:val="18"/>
         </w:rPr>
         <w:t xml:space="preserve"> / Projects</w:t>
+      </w:r>
+    </w:p>
+    <w:p>
+      <w:pPr>
+        <w:spacing w:after="60" w:before="240"/>
+      </w:pPr>
+      <w:r>
+        <w:rPr>
+          <w:b/>
+          <w:bCs/>
+          <w:color w:val="FF5B6E"/>
+          <w:sz w:val="20"/>
+          <w:szCs w:val="20"/>
+        </w:rPr>
+        <w:t xml:space="preserve">[1] </w:t>
+      </w:r>
+      <w:r>
+        <w:rPr>
+          <w:i/>
+          <w:iCs/>
+          <w:color w:val="8B94A3"/>
+          <w:sz w:val="18"/>
+          <w:szCs w:val="18"/>
+        </w:rPr>
+        <w:t xml:space="preserve">기간 / 기관 / 직무 / 내용을 자유롭게 작성</w:t>
+      </w:r>
+    </w:p>
+    <w:p>
+      <w:pPr>
+        <w:pBdr>
+          <w:bottom w:val="single" w:color="D0D5DC" w:sz="4"/>
+        </w:pBdr>
+        <w:spacing w:after="80"/>
+      </w:pPr>
+      <w:r>
+        <w:rPr>
+          <w:color w:val="FFFFFF"/>
+        </w:rPr>
+        <w:t xml:space="preserve">                                                                                                                                </w:t>
+      </w:r>
+    </w:p>
+    <w:p>
+      <w:pPr>
+        <w:pBdr>
+          <w:bottom w:val="single" w:color="D0D5DC" w:sz="4"/>
+        </w:pBdr>
+        <w:spacing w:after="80"/>
+      </w:pPr>
+      <w:r>
+        <w:rPr>
+          <w:color w:val="FFFFFF"/>
+        </w:rPr>
+        <w:t xml:space="preserve">                                                                                                                                </w:t>
+      </w:r>
+    </w:p>
+    <w:p>
+      <w:pPr>
+        <w:pBdr>
+          <w:bottom w:val="single" w:color="D0D5DC" w:sz="4"/>
+        </w:pBdr>
+        <w:spacing w:after="80"/>
+      </w:pPr>
+      <w:r>
+        <w:rPr>
+          <w:color w:val="FFFFFF"/>
+        </w:rPr>
+        <w:t xml:space="preserve">                                                                                                                                </w:t>
+      </w:r>
+    </w:p>
+    <w:p>
+      <w:pPr>
+        <w:spacing w:after="60" w:before="240"/>
+      </w:pPr>
+      <w:r>
+        <w:rPr>
+          <w:b/>
+          <w:bCs/>
+          <w:color w:val="FF5B6E"/>
+          <w:sz w:val="20"/>
+          <w:szCs w:val="20"/>
+        </w:rPr>
+        <w:t xml:space="preserve">[2] </w:t>
+      </w:r>
+      <w:r>
+        <w:rPr>
+          <w:i/>
+          <w:iCs/>
+          <w:color w:val="8B94A3"/>
+          <w:sz w:val="18"/>
+          <w:szCs w:val="18"/>
+        </w:rPr>
+        <w:t xml:space="preserve">기간 / 기관 / 직무 / 내용을 자유롭게 작성</w:t>
+      </w:r>
+    </w:p>
+    <w:p>
+      <w:pPr>
+        <w:pBdr>
+          <w:bottom w:val="single" w:color="D0D5DC" w:sz="4"/>
+        </w:pBdr>
+        <w:spacing w:after="80"/>
+      </w:pPr>
+      <w:r>
+        <w:rPr>
+          <w:color w:val="FFFFFF"/>
+        </w:rPr>
+        <w:t xml:space="preserve">                                                                                                                                </w:t>
+      </w:r>
+    </w:p>
+    <w:p>
+      <w:pPr>
+        <w:pBdr>
+          <w:bottom w:val="single" w:color="D0D5DC" w:sz="4"/>
+        </w:pBdr>
+        <w:spacing w:after="80"/>
+      </w:pPr>
+      <w:r>
+        <w:rPr>
+          <w:color w:val="FFFFFF"/>
+        </w:rPr>
+        <w:t xml:space="preserve">                                                                                                                                </w:t>
+      </w:r>
+    </w:p>
+    <w:p>
+      <w:pPr>
+        <w:pBdr>
+          <w:bottom w:val="single" w:color="D0D5DC" w:sz="4"/>
+        </w:pBdr>
+        <w:spacing w:after="80"/>
+      </w:pPr>
+      <w:r>
+        <w:rPr>
+          <w:color w:val="FFFFFF"/>
+        </w:rPr>
+        <w:t xml:space="preserve">                                                                                                                                </w:t>
+      </w:r>
+    </w:p>
+    <w:p>
+      <w:pPr>
+        <w:spacing w:after="60" w:before="240"/>
+      </w:pPr>
+      <w:r>
+        <w:rPr>
+          <w:b/>
+          <w:bCs/>
+          <w:color w:val="FF5B6E"/>
+          <w:sz w:val="20"/>
+          <w:szCs w:val="20"/>
+        </w:rPr>
+        <w:t xml:space="preserve">[3] </w:t>
+      </w:r>
+      <w:r>
+        <w:rPr>
+          <w:i/>
+          <w:iCs/>
+          <w:color w:val="8B94A3"/>
+          <w:sz w:val="18"/>
+          <w:szCs w:val="18"/>
+        </w:rPr>
+        <w:t xml:space="preserve">기간 / 기관 / 직무 / 내용을 자유롭게 작성</w:t>
+      </w:r>
+    </w:p>
+    <w:p>
+      <w:pPr>
+        <w:pBdr>
+          <w:bottom w:val="single" w:color="D0D5DC" w:sz="4"/>
+        </w:pBdr>
+        <w:spacing w:after="80"/>
+      </w:pPr>
+      <w:r>
+        <w:rPr>
+          <w:color w:val="FFFFFF"/>
+        </w:rPr>
+        <w:t xml:space="preserve">                                                                                                                                </w:t>
+      </w:r>
+    </w:p>
+    <w:p>
+      <w:pPr>
+        <w:pBdr>
+          <w:bottom w:val="single" w:color="D0D5DC" w:sz="4"/>
+        </w:pBdr>
+        <w:spacing w:after="80"/>
+      </w:pPr>
+      <w:r>
+        <w:rPr>
+          <w:color w:val="FFFFFF"/>
+        </w:rPr>
+        <w:t xml:space="preserve">                                                                                                                                </w:t>
+      </w:r>
+    </w:p>
+    <w:p>
+      <w:pPr>
+        <w:pBdr>
+          <w:bottom w:val="single" w:color="D0D5DC" w:sz="4"/>
+        </w:pBdr>
+        <w:spacing w:after="80"/>
+      </w:pPr>
+      <w:r>
+        <w:rPr>
+          <w:color w:val="FFFFFF"/>
+        </w:rPr>
+        <w:t xml:space="preserve">                                                                                                                                </w:t>
+      </w:r>
+    </w:p>
+    <w:p>
+      <w:pPr>
+        <w:pBdr>
+          <w:top w:val="single" w:color="FF5B6E" w:sz="4"/>
+          <w:bottom w:val="none" w:color="FFFFFF" w:sz="0"/>
+          <w:left w:val="single" w:color="FF5B6E" w:sz="24"/>
+          <w:right w:val="none" w:color="FFFFFF" w:sz="0"/>
+        </w:pBdr>
+        <w:shd w:fill="F0F2F5" w:val="clear"/>
+        <w:spacing w:after="200" w:before="360"/>
+      </w:pPr>
+      <w:r>
+        <w:rPr>
+          <w:b/>
+          <w:bCs/>
+          <w:color w:val="1A1D23"/>
+          <w:sz w:val="26"/>
+          <w:szCs w:val="26"/>
+        </w:rPr>
+        <w:t xml:space="preserve">  기타활동  </w:t>
+      </w:r>
+      <w:r>
+        <w:rPr>
+          <w:color w:val="8B94A3"/>
+          <w:sz w:val="18"/>
+          <w:szCs w:val="18"/>
+        </w:rPr>
+        <w:t xml:space="preserve"> / Activities</w:t>
+      </w:r>
+    </w:p>
+    <w:p>
+      <w:pPr>
+        <w:spacing w:after="60" w:before="240"/>
+      </w:pPr>
+      <w:r>
+        <w:rPr>
+          <w:b/>
+          <w:bCs/>
+          <w:color w:val="FF5B6E"/>
+          <w:sz w:val="20"/>
+          <w:szCs w:val="20"/>
+        </w:rPr>
+        <w:t xml:space="preserve">[1] </w:t>
+      </w:r>
+      <w:r>
+        <w:rPr>
+          <w:i/>
+          <w:iCs/>
+          <w:color w:val="8B94A3"/>
+          <w:sz w:val="18"/>
+          <w:szCs w:val="18"/>
+        </w:rPr>
+        <w:t xml:space="preserve">기간 / 기관 / 직무 / 내용을 자유롭게 작성</w:t>
+      </w:r>
+    </w:p>
+    <w:p>
+      <w:pPr>
+        <w:pBdr>
+          <w:bottom w:val="single" w:color="D0D5DC" w:sz="4"/>
+        </w:pBdr>
+        <w:spacing w:after="80"/>
+      </w:pPr>
+      <w:r>
+        <w:rPr>
+          <w:color w:val="FFFFFF"/>
+        </w:rPr>
+        <w:t xml:space="preserve">                                                                                                                                </w:t>
+      </w:r>
+    </w:p>
+    <w:p>
+      <w:pPr>
+        <w:pBdr>
+          <w:bottom w:val="single" w:color="D0D5DC" w:sz="4"/>
+        </w:pBdr>
+        <w:spacing w:after="80"/>
+      </w:pPr>
+      <w:r>
+        <w:rPr>
+          <w:color w:val="FFFFFF"/>
+        </w:rPr>
+        <w:t xml:space="preserve">                                                                                                                                </w:t>
+      </w:r>
+    </w:p>
+    <w:p>
+      <w:pPr>
+        <w:pBdr>
+          <w:bottom w:val="single" w:color="D0D5DC" w:sz="4"/>
+        </w:pBdr>
+        <w:spacing w:after="80"/>
+      </w:pPr>
+      <w:r>
+        <w:rPr>
+          <w:color w:val="FFFFFF"/>
+        </w:rPr>
+        <w:t xml:space="preserve">                                                                                                                                </w:t>
+      </w:r>
+    </w:p>
+    <w:p>
+      <w:pPr>
+        <w:spacing w:after="60" w:before="240"/>
+      </w:pPr>
+      <w:r>
+        <w:rPr>
+          <w:b/>
+          <w:bCs/>
+          <w:color w:val="FF5B6E"/>
+          <w:sz w:val="20"/>
+          <w:szCs w:val="20"/>
+        </w:rPr>
+        <w:t xml:space="preserve">[2] </w:t>
+      </w:r>
+      <w:r>
+        <w:rPr>
+          <w:i/>
+          <w:iCs/>
+          <w:color w:val="8B94A3"/>
+          <w:sz w:val="18"/>
+          <w:szCs w:val="18"/>
+        </w:rPr>
+        <w:t xml:space="preserve">기간 / 기관 / 직무 / 내용을 자유롭게 작성</w:t>
+      </w:r>
+    </w:p>
+    <w:p>
+      <w:pPr>
+        <w:pBdr>
+          <w:bottom w:val="single" w:color="D0D5DC" w:sz="4"/>
+        </w:pBdr>
+        <w:spacing w:after="80"/>
+      </w:pPr>
+      <w:r>
+        <w:rPr>
+          <w:color w:val="FFFFFF"/>
+        </w:rPr>
+        <w:t xml:space="preserve">                                                                                                                                </w:t>
+      </w:r>
+    </w:p>
+    <w:p>
+      <w:pPr>
+        <w:pBdr>
+          <w:bottom w:val="single" w:color="D0D5DC" w:sz="4"/>
+        </w:pBdr>
+        <w:spacing w:after="80"/>
+      </w:pPr>
+      <w:r>
+        <w:rPr>
+          <w:color w:val="FFFFFF"/>
+        </w:rPr>
+        <w:t xml:space="preserve">                                                                                                                                </w:t>
+      </w:r>
+    </w:p>
+    <w:p>
+      <w:pPr>
+        <w:pBdr>
+          <w:bottom w:val="single" w:color="D0D5DC" w:sz="4"/>
+        </w:pBdr>
+        <w:spacing w:after="80"/>
+      </w:pPr>
+      <w:r>
+        <w:rPr>
+          <w:color w:val="FFFFFF"/>
+        </w:rPr>
+        <w:t xml:space="preserve">                                                                                                                                </w:t>
+      </w:r>
+    </w:p>
+    <w:p>
+      <w:pPr>
+        <w:spacing w:after="60" w:before="240"/>
+      </w:pPr>
+      <w:r>
+        <w:rPr>
+          <w:b/>
+          <w:bCs/>
+          <w:color w:val="FF5B6E"/>
+          <w:sz w:val="20"/>
+          <w:szCs w:val="20"/>
+        </w:rPr>
+        <w:t xml:space="preserve">[3] </w:t>
+      </w:r>
+      <w:r>
+        <w:rPr>
+          <w:i/>
+          <w:iCs/>
+          <w:color w:val="8B94A3"/>
+          <w:sz w:val="18"/>
+          <w:szCs w:val="18"/>
+        </w:rPr>
+        <w:t xml:space="preserve">기간 / 기관 / 직무 / 내용을 자유롭게 작성</w:t>
+      </w:r>
+    </w:p>
+    <w:p>
+      <w:pPr>
+        <w:pBdr>
+          <w:bottom w:val="single" w:color="D0D5DC" w:sz="4"/>
+        </w:pBdr>
+        <w:spacing w:after="80"/>
+      </w:pPr>
+      <w:r>
+        <w:rPr>
+          <w:color w:val="FFFFFF"/>
+        </w:rPr>
+        <w:t xml:space="preserve">                                                                                                                                </w:t>
+      </w:r>
+    </w:p>
+    <w:p>
+      <w:pPr>
+        <w:pBdr>
+          <w:bottom w:val="single" w:color="D0D5DC" w:sz="4"/>
+        </w:pBdr>
+        <w:spacing w:after="80"/>
+      </w:pPr>
+      <w:r>
+        <w:rPr>
+          <w:color w:val="FFFFFF"/>
+        </w:rPr>
+        <w:t xml:space="preserve">                                                                                                                                </w:t>
+      </w:r>
+    </w:p>
+    <w:p>
+      <w:pPr>
+        <w:pBdr>
+          <w:bottom w:val="single" w:color="D0D5DC" w:sz="4"/>
+        </w:pBdr>
+        <w:spacing w:after="80"/>
+      </w:pPr>
+      <w:r>
+        <w:rPr>
+          <w:color w:val="FFFFFF"/>
+        </w:rPr>
+        <w:t xml:space="preserve">                                                                                                                                </w:t>
+      </w:r>
+    </w:p>
+    <w:p>
+      <w:pPr>
+        <w:pBdr>
+          <w:top w:val="single" w:color="FF5B6E" w:sz="4"/>
+          <w:bottom w:val="none" w:color="FFFFFF" w:sz="0"/>
+          <w:left w:val="single" w:color="FF5B6E" w:sz="24"/>
+          <w:right w:val="none" w:color="FFFFFF" w:sz="0"/>
+        </w:pBdr>
+        <w:shd w:fill="F0F2F5" w:val="clear"/>
+        <w:spacing w:after="200" w:before="360"/>
+      </w:pPr>
+      <w:r>
+        <w:rPr>
+          <w:b/>
+          <w:bCs/>
+          <w:color w:val="1A1D23"/>
+          <w:sz w:val="26"/>
+          <w:szCs w:val="26"/>
+        </w:rPr>
+        <w:t xml:space="preserve">  활용능력  </w:t>
+      </w:r>
+      <w:r>
+        <w:rPr>
+          <w:color w:val="8B94A3"/>
+          <w:sz w:val="18"/>
+          <w:szCs w:val="18"/>
+        </w:rPr>
+        <w:t xml:space="preserve"> / Skills</w:t>
       </w:r>
     </w:p>
     <w:p>

</xml_diff>